<commit_message>
added data sharing in BioDare section
</commit_message>
<xml_diff>
--- a/instructors/circ-fair-bio-practice-day-2.docx
+++ b/instructors/circ-fair-bio-practice-day-2.docx
@@ -8402,15 +8402,7 @@
           <w:szCs w:val="28"/>
           <w:lang w:val="en-GB" w:eastAsia="en-US" w:bidi="ar-SA"/>
         </w:rPr>
-        <w:t xml:space="preserve">1. </w:t>
-      </w:r>
-      <w:r>
-        <w:rPr>
-          <w:rFonts w:cs="Open Sans"/>
-          <w:szCs w:val="28"/>
-          <w:lang w:val="en-GB" w:eastAsia="en-US" w:bidi="ar-SA"/>
-        </w:rPr>
-        <w:t>Creating experiment</w:t>
+        <w:t>1. Creating experiment</w:t>
       </w:r>
     </w:p>
     <w:p>
@@ -9006,7 +8998,25 @@
           <w:szCs w:val="22"/>
           <w:lang w:val="en-GB" w:eastAsia="en-US" w:bidi="ar-SA"/>
         </w:rPr>
-        <w:t>Select data file (demo-wt-prr.xslx) leave the default File Format as Excell.</w:t>
+        <w:t xml:space="preserve">Select data file (demo-wt-prr.xslx) leave the default File Format as </w:t>
+      </w:r>
+      <w:r>
+        <w:rPr>
+          <w:rFonts w:ascii="Open Sans" w:eastAsia="Calibri" w:hAnsi="Open Sans" w:cs="Open Sans"/>
+          <w:sz w:val="22"/>
+          <w:szCs w:val="22"/>
+          <w:lang w:val="en-GB" w:eastAsia="en-US" w:bidi="ar-SA"/>
+        </w:rPr>
+        <w:t>Excel</w:t>
+      </w:r>
+      <w:r>
+        <w:rPr>
+          <w:rFonts w:ascii="Open Sans" w:eastAsia="Calibri" w:hAnsi="Open Sans" w:cs="Open Sans"/>
+          <w:sz w:val="22"/>
+          <w:szCs w:val="22"/>
+          <w:lang w:val="en-GB" w:eastAsia="en-US" w:bidi="ar-SA"/>
+        </w:rPr>
+        <w:t>.</w:t>
       </w:r>
     </w:p>
     <w:p>
@@ -9218,7 +9228,6 @@
         <w:outlineLvl w:val="1"/>
         <w:rPr>
           <w:rFonts w:ascii="Open Sans" w:eastAsia="Times New Roman" w:hAnsi="Open Sans" w:cs="Open Sans"/>
-          <w:color w:val="2F5496"/>
           <w:sz w:val="26"/>
           <w:szCs w:val="26"/>
           <w:lang w:val="en-GB" w:eastAsia="en-US" w:bidi="ar-SA"/>
@@ -9227,7 +9236,6 @@
       <w:r>
         <w:rPr>
           <w:rFonts w:ascii="Open Sans" w:eastAsia="Times New Roman" w:hAnsi="Open Sans" w:cs="Open Sans"/>
-          <w:color w:val="2F5496"/>
           <w:sz w:val="26"/>
           <w:szCs w:val="26"/>
           <w:lang w:val="en-GB" w:eastAsia="en-US" w:bidi="ar-SA"/>
@@ -9240,7 +9248,6 @@
           <w:rFonts w:ascii="Open Sans" w:eastAsia="Times New Roman" w:hAnsi="Open Sans" w:cs="Open Sans"/>
           <w:b/>
           <w:bCs/>
-          <w:color w:val="2F5496"/>
           <w:sz w:val="26"/>
           <w:szCs w:val="26"/>
           <w:lang w:val="en-GB" w:eastAsia="en-US" w:bidi="ar-SA"/>
@@ -9250,7 +9257,6 @@
       <w:r>
         <w:rPr>
           <w:rFonts w:ascii="Open Sans" w:eastAsia="Times New Roman" w:hAnsi="Open Sans" w:cs="Open Sans"/>
-          <w:color w:val="2F5496"/>
           <w:sz w:val="26"/>
           <w:szCs w:val="26"/>
           <w:lang w:val="en-GB" w:eastAsia="en-US" w:bidi="ar-SA"/>
@@ -9262,7 +9268,6 @@
           <w:rFonts w:ascii="Open Sans" w:eastAsia="Times New Roman" w:hAnsi="Open Sans" w:cs="Open Sans"/>
           <w:b/>
           <w:bCs/>
-          <w:color w:val="2F5496"/>
           <w:sz w:val="26"/>
           <w:szCs w:val="26"/>
           <w:lang w:val="en-GB" w:eastAsia="en-US" w:bidi="ar-SA"/>
@@ -9272,7 +9277,6 @@
       <w:r>
         <w:rPr>
           <w:rFonts w:ascii="Open Sans" w:eastAsia="Times New Roman" w:hAnsi="Open Sans" w:cs="Open Sans"/>
-          <w:color w:val="2F5496"/>
           <w:sz w:val="26"/>
           <w:szCs w:val="26"/>
           <w:lang w:val="en-GB" w:eastAsia="en-US" w:bidi="ar-SA"/>
@@ -9292,6 +9296,13 @@
           <w:lang w:val="en-GB" w:eastAsia="en-US" w:bidi="ar-SA"/>
         </w:rPr>
       </w:pPr>
+      <w:r>
+        <w:rPr>
+          <w:rFonts w:ascii="Open Sans" w:eastAsia="Times New Roman" w:hAnsi="Open Sans" w:cs="Open Sans"/>
+          <w:lang w:eastAsia="en-GB"/>
+        </w:rPr>
+        <w:t> DONE:</w:t>
+      </w:r>
     </w:p>
     <w:p>
       <w:pPr>
@@ -9757,33 +9768,20 @@
     </w:p>
     <w:p>
       <w:pPr>
-        <w:widowControl/>
-        <w:suppressAutoHyphens w:val="0"/>
-        <w:spacing w:after="160" w:line="259" w:lineRule="auto"/>
-        <w:rPr>
-          <w:rFonts w:ascii="Open Sans" w:eastAsia="Calibri" w:hAnsi="Open Sans" w:cs="Open Sans"/>
-          <w:sz w:val="22"/>
-          <w:szCs w:val="22"/>
-          <w:lang w:val="en-GB" w:eastAsia="en-US" w:bidi="ar-SA"/>
-        </w:rPr>
-      </w:pPr>
-    </w:p>
-    <w:p>
-      <w:pPr>
         <w:pStyle w:val="Heading4"/>
         <w:numPr>
           <w:ilvl w:val="0"/>
           <w:numId w:val="30"/>
         </w:numPr>
         <w:rPr>
-          <w:lang w:val="en-GB" w:eastAsia="en-US" w:bidi="ar-SA"/>
-        </w:rPr>
-      </w:pPr>
-      <w:r>
-        <w:rPr>
-          <w:lang w:val="en-GB" w:eastAsia="en-US" w:bidi="ar-SA"/>
-        </w:rPr>
-        <w:t>BioDare2 as circadian resource</w:t>
+          <w:lang w:val="en-GB"/>
+        </w:rPr>
+      </w:pPr>
+      <w:r>
+        <w:rPr>
+          <w:lang w:val="en-GB"/>
+        </w:rPr>
+        <w:t>Data sharing in BioDare</w:t>
       </w:r>
     </w:p>
     <w:p>
@@ -9805,17 +9803,21 @@
           <w:szCs w:val="22"/>
           <w:lang w:val="en-GB" w:eastAsia="en-US" w:bidi="ar-SA"/>
         </w:rPr>
-        <w:t xml:space="preserve">What do you like </w:t>
-      </w:r>
-      <w:r>
+        <w:t xml:space="preserve">To note, but not for this demo: users can make their data and analysis Open in BioDare2, by choosing the green open padlock icon. </w:t>
+      </w:r>
+    </w:p>
+    <w:p>
+      <w:pPr>
+        <w:widowControl/>
+        <w:suppressAutoHyphens w:val="0"/>
+        <w:spacing w:after="160" w:line="259" w:lineRule="auto"/>
         <w:rPr>
           <w:rFonts w:ascii="Open Sans" w:eastAsia="Calibri" w:hAnsi="Open Sans" w:cs="Open Sans"/>
           <w:sz w:val="22"/>
           <w:szCs w:val="22"/>
           <w:lang w:val="en-GB" w:eastAsia="en-US" w:bidi="ar-SA"/>
         </w:rPr>
-        <w:t>about</w:t>
-      </w:r>
+      </w:pPr>
       <w:r>
         <w:rPr>
           <w:rFonts w:ascii="Open Sans" w:eastAsia="Calibri" w:hAnsi="Open Sans" w:cs="Open Sans"/>
@@ -9823,7 +9825,7 @@
           <w:szCs w:val="22"/>
           <w:lang w:val="en-GB" w:eastAsia="en-US" w:bidi="ar-SA"/>
         </w:rPr>
-        <w:t xml:space="preserve"> BioDare2</w:t>
+        <w:t>The Experiment ID is a unique identifier, e.g. 12730755909387.</w:t>
       </w:r>
     </w:p>
     <w:p>
@@ -9845,7 +9847,7 @@
           <w:szCs w:val="22"/>
           <w:lang w:val="en-GB" w:eastAsia="en-US" w:bidi="ar-SA"/>
         </w:rPr>
-        <w:t>-</w:t>
+        <w:t>The URL of the experiment is a permalink, e.g. https://biodare2.ed.ac.uk/experiment/12730755909387</w:t>
       </w:r>
     </w:p>
     <w:p>
@@ -9867,7 +9869,7 @@
           <w:szCs w:val="22"/>
           <w:lang w:val="en-GB" w:eastAsia="en-US" w:bidi="ar-SA"/>
         </w:rPr>
-        <w:t>-</w:t>
+        <w:t>Browse some existing data!</w:t>
       </w:r>
     </w:p>
     <w:p>
@@ -9889,7 +9891,7 @@
           <w:szCs w:val="22"/>
           <w:lang w:val="en-GB" w:eastAsia="en-US" w:bidi="ar-SA"/>
         </w:rPr>
-        <w:t>-</w:t>
+        <w:t>On the main menu, choose Experiments: by default, this only lists your own experiments.</w:t>
       </w:r>
     </w:p>
     <w:p>
@@ -9904,64 +9906,78 @@
           <w:lang w:val="en-GB" w:eastAsia="en-US" w:bidi="ar-SA"/>
         </w:rPr>
       </w:pPr>
-    </w:p>
-    <w:p>
-      <w:pPr>
-        <w:widowControl/>
-        <w:suppressAutoHyphens w:val="0"/>
-        <w:spacing w:after="160" w:line="259" w:lineRule="auto"/>
+      <w:r>
         <w:rPr>
           <w:rFonts w:ascii="Open Sans" w:eastAsia="Calibri" w:hAnsi="Open Sans" w:cs="Open Sans"/>
           <w:sz w:val="22"/>
           <w:szCs w:val="22"/>
           <w:lang w:val="en-GB" w:eastAsia="en-US" w:bidi="ar-SA"/>
         </w:rPr>
-      </w:pPr>
-      <w:r>
+        <w:lastRenderedPageBreak/>
+        <w:t xml:space="preserve">Now turn on the 'Show Public' slider, which lists all public experiments. Try a text search. "SCN" lists studies from Mick Hastngs' lab and others, for example. You could try "leaf".  </w:t>
+      </w:r>
+    </w:p>
+    <w:p>
+      <w:pPr>
+        <w:widowControl/>
+        <w:suppressAutoHyphens w:val="0"/>
+        <w:spacing w:after="160" w:line="259" w:lineRule="auto"/>
         <w:rPr>
           <w:rFonts w:ascii="Open Sans" w:eastAsia="Calibri" w:hAnsi="Open Sans" w:cs="Open Sans"/>
           <w:sz w:val="22"/>
           <w:szCs w:val="22"/>
           <w:lang w:val="en-GB" w:eastAsia="en-US" w:bidi="ar-SA"/>
         </w:rPr>
-        <w:t>What is missing in BioDare2</w:t>
-      </w:r>
-    </w:p>
-    <w:p>
-      <w:pPr>
-        <w:widowControl/>
-        <w:suppressAutoHyphens w:val="0"/>
-        <w:spacing w:after="160" w:line="259" w:lineRule="auto"/>
+      </w:pPr>
+      <w:r>
         <w:rPr>
           <w:rFonts w:ascii="Open Sans" w:eastAsia="Calibri" w:hAnsi="Open Sans" w:cs="Open Sans"/>
           <w:sz w:val="22"/>
           <w:szCs w:val="22"/>
           <w:lang w:val="en-GB" w:eastAsia="en-US" w:bidi="ar-SA"/>
         </w:rPr>
-      </w:pPr>
-      <w:r>
+        <w:t>Then choose an experiment, and browse through their data. You could re-analyse too.</w:t>
+      </w:r>
+    </w:p>
+    <w:p>
+      <w:pPr>
+        <w:pStyle w:val="Heading4"/>
+        <w:numPr>
+          <w:ilvl w:val="0"/>
+          <w:numId w:val="30"/>
+        </w:numPr>
+        <w:rPr>
+          <w:lang w:val="en-GB" w:eastAsia="en-US" w:bidi="ar-SA"/>
+        </w:rPr>
+      </w:pPr>
+      <w:r>
+        <w:rPr>
+          <w:lang w:val="en-GB" w:eastAsia="en-US" w:bidi="ar-SA"/>
+        </w:rPr>
+        <w:t>BioDare2 as circadian resource</w:t>
+      </w:r>
+    </w:p>
+    <w:p>
+      <w:pPr>
+        <w:widowControl/>
+        <w:suppressAutoHyphens w:val="0"/>
+        <w:spacing w:after="160" w:line="259" w:lineRule="auto"/>
         <w:rPr>
           <w:rFonts w:ascii="Open Sans" w:eastAsia="Calibri" w:hAnsi="Open Sans" w:cs="Open Sans"/>
           <w:sz w:val="22"/>
           <w:szCs w:val="22"/>
           <w:lang w:val="en-GB" w:eastAsia="en-US" w:bidi="ar-SA"/>
         </w:rPr>
-        <w:lastRenderedPageBreak/>
-        <w:t>-</w:t>
-      </w:r>
-    </w:p>
-    <w:p>
-      <w:pPr>
-        <w:widowControl/>
-        <w:suppressAutoHyphens w:val="0"/>
-        <w:spacing w:after="160" w:line="259" w:lineRule="auto"/>
+      </w:pPr>
+      <w:r>
         <w:rPr>
           <w:rFonts w:ascii="Open Sans" w:eastAsia="Calibri" w:hAnsi="Open Sans" w:cs="Open Sans"/>
           <w:sz w:val="22"/>
           <w:szCs w:val="22"/>
           <w:lang w:val="en-GB" w:eastAsia="en-US" w:bidi="ar-SA"/>
         </w:rPr>
-      </w:pPr>
+        <w:t xml:space="preserve">What do you like </w:t>
+      </w:r>
       <w:r>
         <w:rPr>
           <w:rFonts w:ascii="Open Sans" w:eastAsia="Calibri" w:hAnsi="Open Sans" w:cs="Open Sans"/>
@@ -9969,43 +9985,39 @@
           <w:szCs w:val="22"/>
           <w:lang w:val="en-GB" w:eastAsia="en-US" w:bidi="ar-SA"/>
         </w:rPr>
-        <w:t>-</w:t>
-      </w:r>
-    </w:p>
-    <w:p>
-      <w:pPr>
-        <w:widowControl/>
-        <w:suppressAutoHyphens w:val="0"/>
-        <w:spacing w:after="160" w:line="259" w:lineRule="auto"/>
+        <w:t>about</w:t>
+      </w:r>
+      <w:r>
         <w:rPr>
           <w:rFonts w:ascii="Open Sans" w:eastAsia="Calibri" w:hAnsi="Open Sans" w:cs="Open Sans"/>
           <w:sz w:val="22"/>
           <w:szCs w:val="22"/>
           <w:lang w:val="en-GB" w:eastAsia="en-US" w:bidi="ar-SA"/>
         </w:rPr>
-      </w:pPr>
-      <w:r>
+        <w:t xml:space="preserve"> BioDare2</w:t>
+      </w:r>
+    </w:p>
+    <w:p>
+      <w:pPr>
+        <w:widowControl/>
+        <w:suppressAutoHyphens w:val="0"/>
+        <w:spacing w:after="160" w:line="259" w:lineRule="auto"/>
         <w:rPr>
           <w:rFonts w:ascii="Open Sans" w:eastAsia="Calibri" w:hAnsi="Open Sans" w:cs="Open Sans"/>
           <w:sz w:val="22"/>
           <w:szCs w:val="22"/>
           <w:lang w:val="en-GB" w:eastAsia="en-US" w:bidi="ar-SA"/>
         </w:rPr>
-        <w:t>-</w:t>
-      </w:r>
-    </w:p>
-    <w:p>
-      <w:pPr>
-        <w:widowControl/>
-        <w:suppressAutoHyphens w:val="0"/>
-        <w:spacing w:after="160" w:line="259" w:lineRule="auto"/>
+      </w:pPr>
+      <w:r>
         <w:rPr>
           <w:rFonts w:ascii="Open Sans" w:eastAsia="Calibri" w:hAnsi="Open Sans" w:cs="Open Sans"/>
           <w:sz w:val="22"/>
           <w:szCs w:val="22"/>
           <w:lang w:val="en-GB" w:eastAsia="en-US" w:bidi="ar-SA"/>
         </w:rPr>
-      </w:pPr>
+        <w:t>-</w:t>
+      </w:r>
     </w:p>
     <w:p>
       <w:pPr>
@@ -10026,7 +10038,7 @@
           <w:szCs w:val="22"/>
           <w:lang w:val="en-GB" w:eastAsia="en-US" w:bidi="ar-SA"/>
         </w:rPr>
-        <w:t>What would make BioDare2 a better community resource</w:t>
+        <w:t>-</w:t>
       </w:r>
     </w:p>
     <w:p>
@@ -10063,35 +10075,193 @@
           <w:lang w:val="en-GB" w:eastAsia="en-US" w:bidi="ar-SA"/>
         </w:rPr>
       </w:pPr>
-      <w:r>
+    </w:p>
+    <w:p>
+      <w:pPr>
+        <w:widowControl/>
+        <w:suppressAutoHyphens w:val="0"/>
+        <w:spacing w:after="160" w:line="259" w:lineRule="auto"/>
         <w:rPr>
           <w:rFonts w:ascii="Open Sans" w:eastAsia="Calibri" w:hAnsi="Open Sans" w:cs="Open Sans"/>
           <w:sz w:val="22"/>
           <w:szCs w:val="22"/>
           <w:lang w:val="en-GB" w:eastAsia="en-US" w:bidi="ar-SA"/>
         </w:rPr>
-        <w:t>-</w:t>
-      </w:r>
-    </w:p>
-    <w:p>
-      <w:pPr>
-        <w:widowControl/>
-        <w:suppressAutoHyphens w:val="0"/>
-        <w:spacing w:after="160" w:line="259" w:lineRule="auto"/>
+      </w:pPr>
+      <w:r>
         <w:rPr>
           <w:rFonts w:ascii="Open Sans" w:eastAsia="Calibri" w:hAnsi="Open Sans" w:cs="Open Sans"/>
           <w:sz w:val="22"/>
           <w:szCs w:val="22"/>
           <w:lang w:val="en-GB" w:eastAsia="en-US" w:bidi="ar-SA"/>
         </w:rPr>
-      </w:pPr>
-      <w:r>
+        <w:t>What is missing in BioDare2</w:t>
+      </w:r>
+    </w:p>
+    <w:p>
+      <w:pPr>
+        <w:widowControl/>
+        <w:suppressAutoHyphens w:val="0"/>
+        <w:spacing w:after="160" w:line="259" w:lineRule="auto"/>
         <w:rPr>
           <w:rFonts w:ascii="Open Sans" w:eastAsia="Calibri" w:hAnsi="Open Sans" w:cs="Open Sans"/>
           <w:sz w:val="22"/>
           <w:szCs w:val="22"/>
           <w:lang w:val="en-GB" w:eastAsia="en-US" w:bidi="ar-SA"/>
         </w:rPr>
+      </w:pPr>
+      <w:r>
+        <w:rPr>
+          <w:rFonts w:ascii="Open Sans" w:eastAsia="Calibri" w:hAnsi="Open Sans" w:cs="Open Sans"/>
+          <w:sz w:val="22"/>
+          <w:szCs w:val="22"/>
+          <w:lang w:val="en-GB" w:eastAsia="en-US" w:bidi="ar-SA"/>
+        </w:rPr>
+        <w:t>-</w:t>
+      </w:r>
+    </w:p>
+    <w:p>
+      <w:pPr>
+        <w:widowControl/>
+        <w:suppressAutoHyphens w:val="0"/>
+        <w:spacing w:after="160" w:line="259" w:lineRule="auto"/>
+        <w:rPr>
+          <w:rFonts w:ascii="Open Sans" w:eastAsia="Calibri" w:hAnsi="Open Sans" w:cs="Open Sans"/>
+          <w:sz w:val="22"/>
+          <w:szCs w:val="22"/>
+          <w:lang w:val="en-GB" w:eastAsia="en-US" w:bidi="ar-SA"/>
+        </w:rPr>
+      </w:pPr>
+      <w:r>
+        <w:rPr>
+          <w:rFonts w:ascii="Open Sans" w:eastAsia="Calibri" w:hAnsi="Open Sans" w:cs="Open Sans"/>
+          <w:sz w:val="22"/>
+          <w:szCs w:val="22"/>
+          <w:lang w:val="en-GB" w:eastAsia="en-US" w:bidi="ar-SA"/>
+        </w:rPr>
+        <w:t>-</w:t>
+      </w:r>
+    </w:p>
+    <w:p>
+      <w:pPr>
+        <w:widowControl/>
+        <w:suppressAutoHyphens w:val="0"/>
+        <w:spacing w:after="160" w:line="259" w:lineRule="auto"/>
+        <w:rPr>
+          <w:rFonts w:ascii="Open Sans" w:eastAsia="Calibri" w:hAnsi="Open Sans" w:cs="Open Sans"/>
+          <w:sz w:val="22"/>
+          <w:szCs w:val="22"/>
+          <w:lang w:val="en-GB" w:eastAsia="en-US" w:bidi="ar-SA"/>
+        </w:rPr>
+      </w:pPr>
+      <w:r>
+        <w:rPr>
+          <w:rFonts w:ascii="Open Sans" w:eastAsia="Calibri" w:hAnsi="Open Sans" w:cs="Open Sans"/>
+          <w:sz w:val="22"/>
+          <w:szCs w:val="22"/>
+          <w:lang w:val="en-GB" w:eastAsia="en-US" w:bidi="ar-SA"/>
+        </w:rPr>
+        <w:t>-</w:t>
+      </w:r>
+    </w:p>
+    <w:p>
+      <w:pPr>
+        <w:widowControl/>
+        <w:suppressAutoHyphens w:val="0"/>
+        <w:spacing w:after="160" w:line="259" w:lineRule="auto"/>
+        <w:rPr>
+          <w:rFonts w:ascii="Open Sans" w:eastAsia="Calibri" w:hAnsi="Open Sans" w:cs="Open Sans"/>
+          <w:sz w:val="22"/>
+          <w:szCs w:val="22"/>
+          <w:lang w:val="en-GB" w:eastAsia="en-US" w:bidi="ar-SA"/>
+        </w:rPr>
+      </w:pPr>
+    </w:p>
+    <w:p>
+      <w:pPr>
+        <w:widowControl/>
+        <w:suppressAutoHyphens w:val="0"/>
+        <w:spacing w:after="160" w:line="259" w:lineRule="auto"/>
+        <w:rPr>
+          <w:rFonts w:ascii="Open Sans" w:eastAsia="Calibri" w:hAnsi="Open Sans" w:cs="Open Sans"/>
+          <w:sz w:val="22"/>
+          <w:szCs w:val="22"/>
+          <w:lang w:val="en-GB" w:eastAsia="en-US" w:bidi="ar-SA"/>
+        </w:rPr>
+      </w:pPr>
+      <w:r>
+        <w:rPr>
+          <w:rFonts w:ascii="Open Sans" w:eastAsia="Calibri" w:hAnsi="Open Sans" w:cs="Open Sans"/>
+          <w:sz w:val="22"/>
+          <w:szCs w:val="22"/>
+          <w:lang w:val="en-GB" w:eastAsia="en-US" w:bidi="ar-SA"/>
+        </w:rPr>
+        <w:t>What would make BioDare2 a better community resource</w:t>
+      </w:r>
+    </w:p>
+    <w:p>
+      <w:pPr>
+        <w:widowControl/>
+        <w:suppressAutoHyphens w:val="0"/>
+        <w:spacing w:after="160" w:line="259" w:lineRule="auto"/>
+        <w:rPr>
+          <w:rFonts w:ascii="Open Sans" w:eastAsia="Calibri" w:hAnsi="Open Sans" w:cs="Open Sans"/>
+          <w:sz w:val="22"/>
+          <w:szCs w:val="22"/>
+          <w:lang w:val="en-GB" w:eastAsia="en-US" w:bidi="ar-SA"/>
+        </w:rPr>
+      </w:pPr>
+      <w:r>
+        <w:rPr>
+          <w:rFonts w:ascii="Open Sans" w:eastAsia="Calibri" w:hAnsi="Open Sans" w:cs="Open Sans"/>
+          <w:sz w:val="22"/>
+          <w:szCs w:val="22"/>
+          <w:lang w:val="en-GB" w:eastAsia="en-US" w:bidi="ar-SA"/>
+        </w:rPr>
+        <w:t>-</w:t>
+      </w:r>
+    </w:p>
+    <w:p>
+      <w:pPr>
+        <w:widowControl/>
+        <w:suppressAutoHyphens w:val="0"/>
+        <w:spacing w:after="160" w:line="259" w:lineRule="auto"/>
+        <w:rPr>
+          <w:rFonts w:ascii="Open Sans" w:eastAsia="Calibri" w:hAnsi="Open Sans" w:cs="Open Sans"/>
+          <w:sz w:val="22"/>
+          <w:szCs w:val="22"/>
+          <w:lang w:val="en-GB" w:eastAsia="en-US" w:bidi="ar-SA"/>
+        </w:rPr>
+      </w:pPr>
+      <w:r>
+        <w:rPr>
+          <w:rFonts w:ascii="Open Sans" w:eastAsia="Calibri" w:hAnsi="Open Sans" w:cs="Open Sans"/>
+          <w:sz w:val="22"/>
+          <w:szCs w:val="22"/>
+          <w:lang w:val="en-GB" w:eastAsia="en-US" w:bidi="ar-SA"/>
+        </w:rPr>
+        <w:t>-</w:t>
+      </w:r>
+    </w:p>
+    <w:p>
+      <w:pPr>
+        <w:widowControl/>
+        <w:suppressAutoHyphens w:val="0"/>
+        <w:spacing w:after="160" w:line="259" w:lineRule="auto"/>
+        <w:rPr>
+          <w:rFonts w:ascii="Open Sans" w:eastAsia="Calibri" w:hAnsi="Open Sans" w:cs="Open Sans"/>
+          <w:sz w:val="22"/>
+          <w:szCs w:val="22"/>
+          <w:lang w:val="en-GB" w:eastAsia="en-US" w:bidi="ar-SA"/>
+        </w:rPr>
+      </w:pPr>
+      <w:r>
+        <w:rPr>
+          <w:rFonts w:ascii="Open Sans" w:eastAsia="Calibri" w:hAnsi="Open Sans" w:cs="Open Sans"/>
+          <w:sz w:val="22"/>
+          <w:szCs w:val="22"/>
+          <w:lang w:val="en-GB" w:eastAsia="en-US" w:bidi="ar-SA"/>
+        </w:rPr>
         <w:t>-</w:t>
       </w:r>
     </w:p>
@@ -10408,6 +10578,7 @@
           <w:sz w:val="23"/>
           <w:szCs w:val="23"/>
         </w:rPr>
+        <w:lastRenderedPageBreak/>
         <w:t>2.      How was the pace of the lesson:</w:t>
       </w:r>
     </w:p>
@@ -15556,6 +15727,7 @@
     <w:lsdException w:name="HTML Sample" w:semiHidden="1" w:unhideWhenUsed="1"/>
     <w:lsdException w:name="HTML Typewriter" w:semiHidden="1" w:unhideWhenUsed="1"/>
     <w:lsdException w:name="HTML Variable" w:semiHidden="1" w:unhideWhenUsed="1"/>
+    <w:lsdException w:name="Normal Table" w:semiHidden="1" w:unhideWhenUsed="1"/>
     <w:lsdException w:name="annotation subject" w:semiHidden="1" w:unhideWhenUsed="1"/>
     <w:lsdException w:name="No List" w:semiHidden="1" w:unhideWhenUsed="1"/>
     <w:lsdException w:name="Outline List 1" w:semiHidden="1" w:unhideWhenUsed="1"/>
@@ -15598,8 +15770,11 @@
     <w:lsdException w:name="Table Contemporary" w:semiHidden="1" w:unhideWhenUsed="1"/>
     <w:lsdException w:name="Table Elegant" w:semiHidden="1" w:unhideWhenUsed="1"/>
     <w:lsdException w:name="Table Professional" w:semiHidden="1" w:unhideWhenUsed="1"/>
+    <w:lsdException w:name="Table Subtle 1" w:semiHidden="1" w:unhideWhenUsed="1"/>
     <w:lsdException w:name="Table Subtle 2" w:semiHidden="1" w:unhideWhenUsed="1"/>
     <w:lsdException w:name="Table Web 1" w:semiHidden="1" w:unhideWhenUsed="1"/>
+    <w:lsdException w:name="Table Web 2" w:semiHidden="1" w:unhideWhenUsed="1"/>
+    <w:lsdException w:name="Table Web 3" w:semiHidden="1" w:unhideWhenUsed="1"/>
     <w:lsdException w:name="Balloon Text" w:semiHidden="1" w:unhideWhenUsed="1"/>
     <w:lsdException w:name="Table Grid" w:uiPriority="39"/>
     <w:lsdException w:name="Table Theme" w:semiHidden="1" w:unhideWhenUsed="1"/>

</xml_diff>